<commit_message>
Clean up convenio de prácticas: fix highlighted placeholders, drop fixed fields
The convenio de prácticas template had leftover " digital"/" - los olivos"
text fragments and an unresolved TIPO_DE____DCTO mergefield, and duración
and subvención were being kept as editable form fields even though the
user's highlighted reference marks them as fixed boilerplate. Clean the
template's placeholders and remove the corresponding DURACION_CONVENIO/
SUBVENCION_NUMERO/SUBVENCION_LETRAS generation code, wire up the new
TIPO_DOCUMENTO placeholder, and hide/stop requiring duración and
remuneración in the UI and validation for tipo "practicas".

Co-Authored-By: Claude Sonnet 5 <noreply@anthropic.com>
</commit_message>
<xml_diff>
--- a/resources/data/convenio-practicas-template.docx
+++ b/resources/data/convenio-practicas-template.docx
@@ -268,7 +268,15 @@
           <w:color w:val="242424"/>
           <w:shd w:val="clear" w:color="auto" w:fill="FFFFFF"/>
         </w:rPr>
-        <w:t>${DIRECCION_TRABAJADOR}</w:t>
+        <w:t xml:space="preserve">${DIRECCION_TRABAJADOR}</w:t>
+      </w:r>
+      <w:r>
+        <w:rPr>
+          <w:rFonts w:ascii="Aptos Narrow" w:hAnsi="Aptos Narrow"/>
+          <w:color w:val="242424"/>
+          <w:shd w:val="clear" w:color="auto" w:fill="FFFFFF"/>
+        </w:rPr>
+        <w:t xml:space="preserve"> </w:t>
       </w:r>
       <w:r>
         <w:rPr>
@@ -292,7 +300,20 @@
           <w:lang w:val="es-PE" w:eastAsia="es-PE"/>
           <w14:ligatures w14:val="none"/>
         </w:rPr>
-        <w:t xml:space="preserve"> ${UNIVERSIDAD}</w:t>
+        <w:t xml:space="preserve"> </w:t>
+      </w:r>
+      <w:r>
+        <w:rPr>
+          <w:rFonts w:ascii="Arial" w:eastAsia="Times New Roman" w:hAnsi="Arial" w:cs="Arial"/>
+          <w:b/>
+          <w:bCs/>
+          <w:kern w:val="0"/>
+          <w:sz w:val="18"/>
+          <w:szCs w:val="18"/>
+          <w:lang w:val="es-PE" w:eastAsia="es-PE"/>
+          <w14:ligatures w14:val="none"/>
+        </w:rPr>
+        <w:t>${UNIVERSIDAD}</w:t>
       </w:r>
       <w:r>
         <w:rPr>
@@ -382,7 +403,29 @@
           <w:lang w:val="es-PE" w:eastAsia="es-PE"/>
           <w14:ligatures w14:val="none"/>
         </w:rPr>
-        <w:t xml:space="preserve">LA EMPRESA es una persona jurídica incorporada en el Registro Nacional de la Micro y Pequeña Empresa (REMYPE), cuyo objeto social se encuentra vinculado a actividades de telecomunicaciones, y requiere contar con apoyo formativo en el área de ${AREA_PRACTICAS} para fortalecer sus procesos internos. </w:t>
+        <w:t xml:space="preserve">LA EMPRESA es una persona jurídica incorporada en el Registro Nacional de la Micro y Pequeña Empresa (REMYPE), cuyo objeto social se encuentra vinculado a actividades de telecomunicaciones, y requiere contar con apoyo formativo en el área de </w:t>
+      </w:r>
+      <w:r>
+        <w:rPr>
+          <w:rFonts w:ascii="Arial" w:eastAsia="Times New Roman" w:hAnsi="Arial" w:cs="Arial"/>
+          <w:kern w:val="0"/>
+          <w:sz w:val="18"/>
+          <w:szCs w:val="18"/>
+          <w:lang w:val="es-PE" w:eastAsia="es-PE"/>
+          <w14:ligatures w14:val="none"/>
+        </w:rPr>
+        <w:t>${AREA_PRACTICAS}</w:t>
+      </w:r>
+      <w:r>
+        <w:rPr>
+          <w:rFonts w:ascii="Arial" w:eastAsia="Times New Roman" w:hAnsi="Arial" w:cs="Arial"/>
+          <w:kern w:val="0"/>
+          <w:sz w:val="18"/>
+          <w:szCs w:val="18"/>
+          <w:lang w:val="es-PE" w:eastAsia="es-PE"/>
+          <w14:ligatures w14:val="none"/>
+        </w:rPr>
+        <w:t xml:space="preserve"> para fortalecer sus procesos internos. </w:t>
       </w:r>
     </w:p>
     <w:p>
@@ -474,18 +517,18 @@
           <w:lang w:val="es-PE" w:eastAsia="es-PE"/>
           <w14:ligatures w14:val="none"/>
         </w:rPr>
-        <w:t xml:space="preserve">área de ${AREA_PRACTICAS}</w:t>
-      </w:r>
-      <w:r>
-        <w:rPr>
-          <w:rFonts w:ascii="Arial" w:eastAsia="Times New Roman" w:hAnsi="Arial" w:cs="Arial"/>
-          <w:kern w:val="0"/>
-          <w:sz w:val="18"/>
-          <w:szCs w:val="18"/>
-          <w:lang w:val="es-PE" w:eastAsia="es-PE"/>
-          <w14:ligatures w14:val="none"/>
-        </w:rPr>
-        <w:t>, complementando su formación académica mediante el aprendizaje y la participación en labores vinculadas a su especialidad.</w:t>
+        <w:t xml:space="preserve">área de ${AREA_PRACTICAS} </w:t>
+      </w:r>
+      <w:r>
+        <w:rPr>
+          <w:rFonts w:ascii="Arial" w:eastAsia="Times New Roman" w:hAnsi="Arial" w:cs="Arial"/>
+          <w:kern w:val="0"/>
+          <w:sz w:val="18"/>
+          <w:szCs w:val="18"/>
+          <w:lang w:val="es-PE" w:eastAsia="es-PE"/>
+          <w14:ligatures w14:val="none"/>
+        </w:rPr>
+        <w:t xml:space="preserve">, complementando su formación académica mediante el aprendizaje y la participación en labores vinculadas a su especialidad.</w:t>
       </w:r>
     </w:p>
     <w:p>
@@ -540,7 +583,29 @@
           <w:lang w:val="es-PE" w:eastAsia="es-PE"/>
           <w14:ligatures w14:val="none"/>
         </w:rPr>
-        <w:t xml:space="preserve">El presente convenio tiene por finalidad que EL PRACTICANTE desarrolle y consolide conocimientos, habilidades y competencias propias de su formación académica, a través de experiencias reales de trabajo en el área de ${AREA_PRACTICAS} de la EMPRESA, bajo supervisión y orientación.</w:t>
+        <w:t xml:space="preserve">El presente convenio tiene por finalidad que EL PRACTICANTE desarrolle y consolide conocimientos, habilidades y competencias propias de su formación académica, a través de experiencias reales de trabajo en el área de </w:t>
+      </w:r>
+      <w:r>
+        <w:rPr>
+          <w:rFonts w:ascii="Arial" w:eastAsia="Times New Roman" w:hAnsi="Arial" w:cs="Arial"/>
+          <w:kern w:val="0"/>
+          <w:sz w:val="18"/>
+          <w:szCs w:val="18"/>
+          <w:lang w:val="es-PE" w:eastAsia="es-PE"/>
+          <w14:ligatures w14:val="none"/>
+        </w:rPr>
+        <w:t>${AREA_PRACTICAS}</w:t>
+      </w:r>
+      <w:r>
+        <w:rPr>
+          <w:rFonts w:ascii="Arial" w:eastAsia="Times New Roman" w:hAnsi="Arial" w:cs="Arial"/>
+          <w:kern w:val="0"/>
+          <w:sz w:val="18"/>
+          <w:szCs w:val="18"/>
+          <w:lang w:val="es-PE" w:eastAsia="es-PE"/>
+          <w14:ligatures w14:val="none"/>
+        </w:rPr>
+        <w:t xml:space="preserve"> de la EMPRESA, bajo supervisión y orientación.</w:t>
       </w:r>
     </w:p>
     <w:p>
@@ -608,7 +673,7 @@
           <w:lang w:val="es-PE" w:eastAsia="es-PE"/>
           <w14:ligatures w14:val="none"/>
         </w:rPr>
-        <w:t xml:space="preserve">${DURACION_CONVENIO}</w:t>
+        <w:t xml:space="preserve">3 meses</w:t>
       </w:r>
       <w:r>
         <w:rPr>
@@ -948,7 +1013,7 @@
           <w:lang w:val="es-PE" w:eastAsia="es-PE"/>
           <w14:ligatures w14:val="none"/>
         </w:rPr>
-        <w:t xml:space="preserve">${SUBVENCION_NUMERO} (${SUBVENCION_LETRAS})</w:t>
+        <w:t xml:space="preserve">S/ 1,230.00  (Mil ciento treinta y 00/100 soles)</w:t>
       </w:r>
       <w:r>
         <w:rPr>
@@ -1099,6 +1164,7 @@
           <w:lang w:val="es-PE" w:eastAsia="es-PE"/>
           <w14:ligatures w14:val="none"/>
         </w:rPr>
+        <w:lastRenderedPageBreak/>
         <w:t>OCTAVO. - ACTIVIDADES FORMATIVAS</w:t>
       </w:r>
     </w:p>
@@ -1136,7 +1202,7 @@
           <w:sz w:val="18"/>
           <w:szCs w:val="18"/>
         </w:rPr>
-        <w:t>Marketing Digital</w:t>
+        <w:t>${AREA_PRACTICAS}</w:t>
       </w:r>
       <w:r>
         <w:rPr>
@@ -1563,7 +1629,20 @@
           <w:lang w:val="es-PE" w:eastAsia="es-PE"/>
           <w14:ligatures w14:val="none"/>
         </w:rPr>
-        <w:t xml:space="preserve">actividades adicionales afines a su formación y al Marketing digital</w:t>
+        <w:t xml:space="preserve">actividades adicionales afines a su formación y al </w:t>
+      </w:r>
+      <w:r>
+        <w:rPr>
+          <w:rFonts w:ascii="Arial" w:eastAsia="Times New Roman" w:hAnsi="Arial" w:cs="Arial"/>
+          <w:b/>
+          <w:bCs/>
+          <w:kern w:val="0"/>
+          <w:sz w:val="18"/>
+          <w:szCs w:val="18"/>
+          <w:lang w:val="es-PE" w:eastAsia="es-PE"/>
+          <w14:ligatures w14:val="none"/>
+        </w:rPr>
+        <w:t>${AREA_PRACTICAS}</w:t>
       </w:r>
       <w:r>
         <w:rPr>
@@ -2213,7 +2292,29 @@
           <w:lang w:val="es-PE" w:eastAsia="es-PE"/>
           <w14:ligatures w14:val="none"/>
         </w:rPr>
-        <w:t xml:space="preserve">Leído que fue el presente convenio, las partes lo firman en señal de conformidad, por duplicado, en la ciudad de lima, a los ${FECHA_FIRMA_CONVENIO}.</w:t>
+        <w:t xml:space="preserve">Leído que fue el presente convenio, las partes lo firman en señal de conformidad, por duplicado, en la ciudad de lima, a los </w:t>
+      </w:r>
+      <w:r>
+        <w:rPr>
+          <w:rFonts w:ascii="Arial" w:eastAsia="Times New Roman" w:hAnsi="Arial" w:cs="Arial"/>
+          <w:kern w:val="0"/>
+          <w:sz w:val="18"/>
+          <w:szCs w:val="18"/>
+          <w:lang w:val="es-PE" w:eastAsia="es-PE"/>
+          <w14:ligatures w14:val="none"/>
+        </w:rPr>
+        <w:t xml:space="preserve">${FECHA_FIRMA_CONVENIO}</w:t>
+      </w:r>
+      <w:r>
+        <w:rPr>
+          <w:rFonts w:ascii="Arial" w:eastAsia="Times New Roman" w:hAnsi="Arial" w:cs="Arial"/>
+          <w:kern w:val="0"/>
+          <w:sz w:val="18"/>
+          <w:szCs w:val="18"/>
+          <w:lang w:val="es-PE" w:eastAsia="es-PE"/>
+          <w14:ligatures w14:val="none"/>
+        </w:rPr>
+        <w:t>.</w:t>
       </w:r>
     </w:p>
     <w:p>
@@ -2373,29 +2474,7 @@
                                 <w:sz w:val="20"/>
                                 <w:szCs w:val="20"/>
                               </w:rPr>
-                              <w:fldChar w:fldCharType="begin"/>
-                              <w:instrText xml:space="preserve"> MERGEFIELD TIPO_DE____DCTO </w:instrText>
-                              <w:fldChar w:fldCharType="separate"/>
-                            </w:r>
-                            <w:r>
-                              <w:rPr>
-                                <w:b/>
-                                <w:bCs/>
-                                <w:noProof/>
-                                <w:sz w:val="20"/>
-                                <w:szCs w:val="20"/>
-                              </w:rPr>
-                              <w:t>DNI</w:t>
-                            </w:r>
-                            <w:r>
-                              <w:rPr>
-                                <w:b/>
-                                <w:bCs/>
-                                <w:sz w:val="20"/>
-                                <w:szCs w:val="20"/>
-                              </w:rPr>
-                              <w:fldChar w:fldCharType="end"/>
-                              <w:t xml:space="preserve"> </w:t>
+                              <w:t xml:space="preserve">${TIPO_DOCUMENTO} </w:t>
                             </w:r>
                             <w:r>
                               <w:rPr>
@@ -2513,29 +2592,7 @@
                           <w:sz w:val="20"/>
                           <w:szCs w:val="20"/>
                         </w:rPr>
-                        <w:fldChar w:fldCharType="begin"/>
-                        <w:instrText xml:space="preserve"> MERGEFIELD TIPO_DE____DCTO </w:instrText>
-                        <w:fldChar w:fldCharType="separate"/>
-                      </w:r>
-                      <w:r>
-                        <w:rPr>
-                          <w:b/>
-                          <w:bCs/>
-                          <w:noProof/>
-                          <w:sz w:val="20"/>
-                          <w:szCs w:val="20"/>
-                        </w:rPr>
-                        <w:t>DNI</w:t>
-                      </w:r>
-                      <w:r>
-                        <w:rPr>
-                          <w:b/>
-                          <w:bCs/>
-                          <w:sz w:val="20"/>
-                          <w:szCs w:val="20"/>
-                        </w:rPr>
-                        <w:fldChar w:fldCharType="end"/>
-                        <w:t xml:space="preserve"> </w:t>
+                        <w:t xml:space="preserve">${TIPO_DOCUMENTO} </w:t>
                       </w:r>
                       <w:r>
                         <w:rPr>

</xml_diff>